<commit_message>
update02 doc informe 01
</commit_message>
<xml_diff>
--- a/informe practica 01.docx
+++ b/informe practica 01.docx
@@ -90,7 +90,7 @@
               </wp:anchor>
             </w:drawing>
           </mc:Choice>
-          <mc:Fallback xmlns:w16sdtfl="http://schemas.microsoft.com/office/word/2024/wordml/sdtformatlock" xmlns:w16sdtdh="http://schemas.microsoft.com/office/word/2020/wordml/sdtdatahash" xmlns:w16du="http://schemas.microsoft.com/office/word/2023/wordml/word16du" xmlns:w16="http://schemas.microsoft.com/office/word/2018/wordml" xmlns:w16cex="http://schemas.microsoft.com/office/word/2018/wordml/cex" xmlns:oel="http://schemas.microsoft.com/office/2019/extlst">
+          <mc:Fallback xmlns:oel="http://schemas.microsoft.com/office/2019/extlst" xmlns:w16cex="http://schemas.microsoft.com/office/word/2018/wordml/cex" xmlns:w16="http://schemas.microsoft.com/office/word/2018/wordml" xmlns:w16du="http://schemas.microsoft.com/office/word/2023/wordml/word16du" xmlns:w16sdtdh="http://schemas.microsoft.com/office/word/2020/wordml/sdtdatahash" xmlns:w16sdtfl="http://schemas.microsoft.com/office/word/2024/wordml/sdtformatlock">
             <w:pict>
               <v:line w14:anchorId="79000A9E" id="Conector recto 11" o:spid="_x0000_s1026" style="position:absolute;flip:y;z-index:251662336;visibility:visible;mso-wrap-style:square;mso-width-percent:0;mso-height-percent:0;mso-wrap-distance-left:9pt;mso-wrap-distance-top:0;mso-wrap-distance-right:9pt;mso-wrap-distance-bottom:0;mso-position-horizontal:absolute;mso-position-horizontal-relative:text;mso-position-vertical:absolute;mso-position-vertical-relative:text;mso-width-percent:0;mso-height-percent:0;mso-width-relative:page;mso-height-relative:page" from="0,9.45pt" to="495pt,9.45pt" o:gfxdata="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" o:allowincell="f" strokeweight="4.5pt">
                 <v:stroke linestyle="thickThin"/>
@@ -444,7 +444,7 @@
               </wp:anchor>
             </w:drawing>
           </mc:Choice>
-          <mc:Fallback xmlns:w16sdtfl="http://schemas.microsoft.com/office/word/2024/wordml/sdtformatlock" xmlns:w16sdtdh="http://schemas.microsoft.com/office/word/2020/wordml/sdtdatahash" xmlns:w16du="http://schemas.microsoft.com/office/word/2023/wordml/word16du" xmlns:w16="http://schemas.microsoft.com/office/word/2018/wordml" xmlns:w16cex="http://schemas.microsoft.com/office/word/2018/wordml/cex" xmlns:oel="http://schemas.microsoft.com/office/2019/extlst">
+          <mc:Fallback xmlns:oel="http://schemas.microsoft.com/office/2019/extlst" xmlns:w16cex="http://schemas.microsoft.com/office/word/2018/wordml/cex" xmlns:w16="http://schemas.microsoft.com/office/word/2018/wordml" xmlns:w16du="http://schemas.microsoft.com/office/word/2023/wordml/word16du" xmlns:w16sdtdh="http://schemas.microsoft.com/office/word/2020/wordml/sdtdatahash" xmlns:w16sdtfl="http://schemas.microsoft.com/office/word/2024/wordml/sdtformatlock">
             <w:pict>
               <v:shapetype w14:anchorId="23E962EA" id="_x0000_t66" coordsize="21600,21600" o:spt="66" adj="5400,5400" path="m@0,l@0@1,21600@1,21600@2@0@2@0,21600,,10800xe">
                 <v:stroke joinstyle="miter"/>
@@ -542,7 +542,7 @@
               </wp:anchor>
             </w:drawing>
           </mc:Choice>
-          <mc:Fallback xmlns:w16sdtfl="http://schemas.microsoft.com/office/word/2024/wordml/sdtformatlock" xmlns:w16sdtdh="http://schemas.microsoft.com/office/word/2020/wordml/sdtdatahash" xmlns:w16du="http://schemas.microsoft.com/office/word/2023/wordml/word16du" xmlns:w16="http://schemas.microsoft.com/office/word/2018/wordml" xmlns:w16cex="http://schemas.microsoft.com/office/word/2018/wordml/cex" xmlns:oel="http://schemas.microsoft.com/office/2019/extlst">
+          <mc:Fallback xmlns:oel="http://schemas.microsoft.com/office/2019/extlst" xmlns:w16cex="http://schemas.microsoft.com/office/word/2018/wordml/cex" xmlns:w16="http://schemas.microsoft.com/office/word/2018/wordml" xmlns:w16du="http://schemas.microsoft.com/office/word/2023/wordml/word16du" xmlns:w16sdtdh="http://schemas.microsoft.com/office/word/2020/wordml/sdtdatahash" xmlns:w16sdtfl="http://schemas.microsoft.com/office/word/2024/wordml/sdtformatlock">
             <w:pict>
               <v:shapetype w14:anchorId="001D26AC" id="_x0000_t13" coordsize="21600,21600" o:spt="13" adj="16200,5400" path="m@0,l@0@1,0@1,0@2@0@2@0,21600,21600,10800xe">
                 <v:stroke joinstyle="miter"/>
@@ -22716,95 +22716,25 @@
           <w:sz w:val="22"/>
           <w:lang w:val="es-PE"/>
         </w:rPr>
-        <w:t xml:space="preserve">Sí, logré cumplir con el objetivo de la tarea, ya que pude desarrollar correctamente la pantalla de </w:t>
+        <w:t xml:space="preserve">Sí, logré cumplir con el objetivo de la tarea, ya que pude elaborar de manera correcta el mapa conceptual sobre los principales conceptos de Big Data, organizando la información de forma clara y visual. Me sentí satisfecho con el resultado porque logré representar no solo la definición general, sino también las 5 </w:t>
       </w:r>
+      <w:proofErr w:type="spellStart"/>
       <w:r>
         <w:rPr>
           <w:b w:val="0"/>
           <w:sz w:val="22"/>
           <w:lang w:val="es-PE"/>
         </w:rPr>
-        <w:t>Log</w:t>
+        <w:t>V’s</w:t>
       </w:r>
+      <w:proofErr w:type="spellEnd"/>
       <w:r>
         <w:rPr>
           <w:b w:val="0"/>
           <w:sz w:val="22"/>
           <w:lang w:val="es-PE"/>
         </w:rPr>
-        <w:t>i</w:t>
-      </w:r>
-      <w:r>
-        <w:rPr>
-          <w:b w:val="0"/>
-          <w:sz w:val="22"/>
-          <w:lang w:val="es-PE"/>
-        </w:rPr>
-        <w:t>n</w:t>
-      </w:r>
-      <w:r>
-        <w:rPr>
-          <w:b w:val="0"/>
-          <w:sz w:val="22"/>
-          <w:lang w:val="es-PE"/>
-        </w:rPr>
-        <w:t xml:space="preserve"> del estudiante, incluyendo las validaciones básicas y un diseño intuitivo. Me sentí satisfecho con el resultado porque funcionó </w:t>
-      </w:r>
-      <w:r>
-        <w:rPr>
-          <w:b w:val="0"/>
-          <w:sz w:val="22"/>
-          <w:lang w:val="es-PE"/>
-        </w:rPr>
-        <w:t>a pesar de los</w:t>
-      </w:r>
-      <w:r>
-        <w:rPr>
-          <w:b w:val="0"/>
-          <w:sz w:val="22"/>
-          <w:lang w:val="es-PE"/>
-        </w:rPr>
-        <w:t xml:space="preserve"> errores </w:t>
-      </w:r>
-      <w:r>
-        <w:rPr>
-          <w:b w:val="0"/>
-          <w:sz w:val="22"/>
-          <w:lang w:val="es-PE"/>
-        </w:rPr>
-        <w:t xml:space="preserve">que presentaba </w:t>
-      </w:r>
-      <w:r>
-        <w:rPr>
-          <w:b w:val="0"/>
-          <w:sz w:val="22"/>
-          <w:lang w:val="es-PE"/>
-        </w:rPr>
-        <w:t xml:space="preserve">llegue a arreglarlo </w:t>
-      </w:r>
-      <w:r>
-        <w:rPr>
-          <w:b w:val="0"/>
-          <w:sz w:val="22"/>
-          <w:lang w:val="es-PE"/>
-        </w:rPr>
-        <w:t xml:space="preserve">y </w:t>
-      </w:r>
-      <w:r>
-        <w:rPr>
-          <w:b w:val="0"/>
-          <w:sz w:val="22"/>
-          <w:lang w:val="es-PE"/>
-        </w:rPr>
-        <w:t xml:space="preserve">al final este </w:t>
-      </w:r>
-      <w:r>
-        <w:rPr>
-          <w:b w:val="0"/>
-          <w:sz w:val="22"/>
-          <w:lang w:val="es-PE"/>
-        </w:rPr>
-        <w:t>respondió como esperaba al momento de probarla.</w:t>
+        <w:t xml:space="preserve"> (Volumen, Velocidad, Variedad, Veracidad y Valor) y sus aplicaciones prácticas. Esto me permitió comprender mejor las relaciones entre los conceptos y reforzar mi aprendizaje.</w:t>
       </w:r>
     </w:p>
     <w:p>
@@ -22838,39 +22768,7 @@
           <w:sz w:val="22"/>
           <w:lang w:val="es-PE"/>
         </w:rPr>
-        <w:t>Además, r</w:t>
-      </w:r>
-      <w:r>
-        <w:rPr>
-          <w:b w:val="0"/>
-          <w:sz w:val="22"/>
-          <w:lang w:val="es-PE"/>
-        </w:rPr>
-        <w:t>ecomiendo seguir buenas prácticas al escribir el código, como mantenerlo limpio y ordenado, probar constantemente cada componente a medida que se avanza, y verificar que las validaciones estén funcionando antes de continuar con otras funcionalidades</w:t>
-      </w:r>
-      <w:r>
-        <w:rPr>
-          <w:b w:val="0"/>
-          <w:sz w:val="22"/>
-          <w:lang w:val="es-PE"/>
-        </w:rPr>
-        <w:t>, ya que esto te ayudara a no tener conflictos con otros compañeros</w:t>
-      </w:r>
-      <w:r>
-        <w:rPr>
-          <w:b w:val="0"/>
-          <w:sz w:val="22"/>
-          <w:lang w:val="es-PE"/>
-        </w:rPr>
-        <w:t>, t</w:t>
-      </w:r>
-      <w:r>
-        <w:rPr>
-          <w:b w:val="0"/>
-          <w:sz w:val="22"/>
-          <w:lang w:val="es-PE"/>
-        </w:rPr>
-        <w:t>ambién es importante mantener una copia de seguridad del proyecto para evitar pérdidas en caso de errores o fallos técnicos.</w:t>
+        <w:t>Otras recomendaciones:</w:t>
       </w:r>
     </w:p>
     <w:p>
@@ -22878,40 +22776,132 @@
         <w:spacing w:line="360" w:lineRule="auto"/>
         <w:ind w:right="-1135"/>
         <w:rPr>
-          <w:sz w:val="22"/>
-          <w:lang w:val="es-MX"/>
-        </w:rPr>
-      </w:pPr>
+          <w:b w:val="0"/>
+          <w:sz w:val="22"/>
+          <w:lang w:val="es-PE"/>
+        </w:rPr>
+      </w:pPr>
+      <w:r>
+        <w:rPr>
+          <w:b w:val="0"/>
+          <w:sz w:val="22"/>
+          <w:lang w:val="es-PE"/>
+        </w:rPr>
+        <w:t>-</w:t>
+      </w:r>
+      <w:r>
+        <w:rPr>
+          <w:b w:val="0"/>
+          <w:sz w:val="22"/>
+          <w:lang w:val="es-PE"/>
+        </w:rPr>
+        <w:t xml:space="preserve"> </w:t>
+      </w:r>
+      <w:r>
+        <w:rPr>
+          <w:b w:val="0"/>
+          <w:sz w:val="22"/>
+          <w:lang w:val="es-PE"/>
+        </w:rPr>
+        <w:t>M</w:t>
+      </w:r>
+      <w:r>
+        <w:rPr>
+          <w:b w:val="0"/>
+          <w:sz w:val="22"/>
+          <w:lang w:val="es-PE"/>
+        </w:rPr>
+        <w:t>antener siempre una estructura organizada y jerárquica en los mapas conceptuales para facilitar su lectura.</w:t>
+      </w:r>
+      <w:r>
+        <w:rPr>
+          <w:b w:val="0"/>
+          <w:sz w:val="22"/>
+          <w:lang w:val="es-PE"/>
+        </w:rPr>
+        <w:t xml:space="preserve"> </w:t>
+      </w:r>
     </w:p>
     <w:p>
       <w:pPr>
         <w:spacing w:line="360" w:lineRule="auto"/>
         <w:ind w:right="-1135"/>
         <w:rPr>
-          <w:sz w:val="22"/>
-          <w:lang w:val="es-MX"/>
-        </w:rPr>
-      </w:pPr>
+          <w:b w:val="0"/>
+          <w:sz w:val="22"/>
+          <w:lang w:val="es-PE"/>
+        </w:rPr>
+      </w:pPr>
+      <w:r>
+        <w:rPr>
+          <w:b w:val="0"/>
+          <w:sz w:val="22"/>
+          <w:lang w:val="es-PE"/>
+        </w:rPr>
+        <w:t>- U</w:t>
+      </w:r>
+      <w:r>
+        <w:rPr>
+          <w:b w:val="0"/>
+          <w:sz w:val="22"/>
+          <w:lang w:val="es-PE"/>
+        </w:rPr>
+        <w:t>sar un diseño claro y visualmente atractivo, evitando sobrecargar de texto los nodos.</w:t>
+      </w:r>
     </w:p>
     <w:p>
       <w:pPr>
         <w:spacing w:line="360" w:lineRule="auto"/>
         <w:ind w:right="-1135"/>
         <w:rPr>
-          <w:sz w:val="22"/>
-          <w:lang w:val="es-MX"/>
-        </w:rPr>
-      </w:pPr>
+          <w:b w:val="0"/>
+          <w:sz w:val="22"/>
+          <w:lang w:val="es-PE"/>
+        </w:rPr>
+      </w:pPr>
+      <w:r>
+        <w:rPr>
+          <w:b w:val="0"/>
+          <w:sz w:val="22"/>
+          <w:lang w:val="es-PE"/>
+        </w:rPr>
+        <w:t xml:space="preserve">- </w:t>
+      </w:r>
+      <w:r>
+        <w:rPr>
+          <w:b w:val="0"/>
+          <w:sz w:val="22"/>
+          <w:lang w:val="es-PE"/>
+        </w:rPr>
+        <w:t>Relacionar los conceptos con ejemplos prácticos, ya que esto ayuda a comprender mejor su aplicación.</w:t>
+      </w:r>
     </w:p>
     <w:p>
       <w:pPr>
         <w:spacing w:line="360" w:lineRule="auto"/>
         <w:ind w:right="-1135"/>
         <w:rPr>
-          <w:sz w:val="22"/>
-          <w:lang w:val="es-MX"/>
-        </w:rPr>
-      </w:pPr>
+          <w:b w:val="0"/>
+          <w:sz w:val="22"/>
+          <w:lang w:val="es-PE"/>
+        </w:rPr>
+      </w:pPr>
+      <w:r>
+        <w:rPr>
+          <w:b w:val="0"/>
+          <w:sz w:val="22"/>
+          <w:lang w:val="es-PE"/>
+        </w:rPr>
+        <w:t xml:space="preserve">- </w:t>
+      </w:r>
+      <w:r>
+        <w:rPr>
+          <w:b w:val="0"/>
+          <w:sz w:val="22"/>
+          <w:lang w:val="es-PE"/>
+        </w:rPr>
+        <w:t>Guardar una copia digital y una versión de respaldo del mapa conceptual, para no perder el trabajo en caso de errores técnicos.</w:t>
+      </w:r>
     </w:p>
     <w:p>
       <w:pPr>
@@ -22922,6 +22912,22 @@
           <w:lang w:val="es-MX"/>
         </w:rPr>
       </w:pPr>
+      <w:r>
+        <w:rPr>
+          <w:b w:val="0"/>
+          <w:sz w:val="22"/>
+          <w:lang w:val="es-PE"/>
+        </w:rPr>
+        <w:t xml:space="preserve">- </w:t>
+      </w:r>
+      <w:r>
+        <w:rPr>
+          <w:b w:val="0"/>
+          <w:sz w:val="22"/>
+          <w:lang w:val="es-PE"/>
+        </w:rPr>
+        <w:t>Revisar constantemente la coherencia y la ortografía, garantizando que el esquema cumpla su función como herramienta de estudio.</w:t>
+      </w:r>
     </w:p>
     <w:p>
       <w:pPr>
@@ -22982,16 +22988,8 @@
           <w:lang w:val="es-MX"/>
         </w:rPr>
       </w:pPr>
-    </w:p>
-    <w:p>
-      <w:pPr>
-        <w:spacing w:line="360" w:lineRule="auto"/>
-        <w:ind w:right="-1135"/>
-        <w:rPr>
-          <w:sz w:val="22"/>
-          <w:lang w:val="es-MX"/>
-        </w:rPr>
-      </w:pPr>
+      <w:bookmarkStart w:id="0" w:name="_GoBack"/>
+      <w:bookmarkEnd w:id="0"/>
     </w:p>
     <w:tbl>
       <w:tblPr>
@@ -23072,7 +23070,6 @@
                 <w:sz w:val="22"/>
               </w:rPr>
             </w:pPr>
-            <w:bookmarkStart w:id="0" w:name="_GoBack"/>
             <w:r>
               <w:rPr>
                 <w:b w:val="0"/>
@@ -23135,7 +23132,6 @@
                 </wp:anchor>
               </w:drawing>
             </w:r>
-            <w:bookmarkEnd w:id="0"/>
           </w:p>
         </w:tc>
       </w:tr>
@@ -23224,7 +23220,7 @@
                     </wp:anchor>
                   </w:drawing>
                 </mc:Choice>
-                <mc:Fallback xmlns:w16sdtfl="http://schemas.microsoft.com/office/word/2024/wordml/sdtformatlock" xmlns:w16sdtdh="http://schemas.microsoft.com/office/word/2020/wordml/sdtdatahash" xmlns:w16du="http://schemas.microsoft.com/office/word/2023/wordml/word16du" xmlns:w16="http://schemas.microsoft.com/office/word/2018/wordml" xmlns:w16cex="http://schemas.microsoft.com/office/word/2018/wordml/cex" xmlns:oel="http://schemas.microsoft.com/office/2019/extlst">
+                <mc:Fallback xmlns:oel="http://schemas.microsoft.com/office/2019/extlst" xmlns:w16cex="http://schemas.microsoft.com/office/word/2018/wordml/cex" xmlns:w16="http://schemas.microsoft.com/office/word/2018/wordml" xmlns:w16du="http://schemas.microsoft.com/office/word/2023/wordml/word16du" xmlns:w16sdtdh="http://schemas.microsoft.com/office/word/2020/wordml/sdtdatahash" xmlns:w16sdtfl="http://schemas.microsoft.com/office/word/2024/wordml/sdtformatlock">
                   <w:pict>
                     <v:rect w14:anchorId="18B09586" id="Rectángulo 9" o:spid="_x0000_s1026" style="position:absolute;margin-left:456.15pt;margin-top:4.25pt;width:44.65pt;height:25.85pt;z-index:251674624;visibility:visible;mso-wrap-style:square;mso-wrap-distance-left:9pt;mso-wrap-distance-top:0;mso-wrap-distance-right:9pt;mso-wrap-distance-bottom:0;mso-position-horizontal:absolute;mso-position-horizontal-relative:text;mso-position-vertical:absolute;mso-position-vertical-relative:text;v-text-anchor:middle" o:gfxdata="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" filled="f" strokecolor="#09101d [484]" strokeweight="1pt"/>
                   </w:pict>
@@ -26321,12 +26317,31 @@
 </file>
 
 <file path=customXml/item1.xml><?xml version="1.0" encoding="utf-8"?>
-<?mso-contentType ?>
-<FormTemplates xmlns="http://schemas.microsoft.com/sharepoint/v3/contenttype/forms">
-  <Display>DocumentLibraryForm</Display>
-  <Edit>DocumentLibraryForm</Edit>
-  <New>DocumentLibraryForm</New>
-</FormTemplates>
+<p:properties xmlns:p="http://schemas.microsoft.com/office/2006/metadata/properties" xmlns:xsi="http://www.w3.org/2001/XMLSchema-instance" xmlns:pc="http://schemas.microsoft.com/office/infopath/2007/PartnerControls">
+  <documentManagement>
+    <TaxCatchAll xmlns="ee27a0f9-7ff9-4c05-b61a-f7053cc3ff56" xsi:nil="true"/>
+    <lcf76f155ced4ddcb4097134ff3c332f xmlns="8b0498ea-4bc6-4676-a87b-9cffe7f59fc7">
+      <Terms xmlns="http://schemas.microsoft.com/office/infopath/2007/PartnerControls"/>
+    </lcf76f155ced4ddcb4097134ff3c332f>
+    <Validado xmlns="8b0498ea-4bc6-4676-a87b-9cffe7f59fc7">false</Validado>
+    <Tarea3 xmlns="8b0498ea-4bc6-4676-a87b-9cffe7f59fc7" xsi:nil="true"/>
+    <NumTareas xmlns="8b0498ea-4bc6-4676-a87b-9cffe7f59fc7" xsi:nil="true"/>
+    <Maquetado xmlns="8b0498ea-4bc6-4676-a87b-9cffe7f59fc7">false</Maquetado>
+    <Validado_v2 xmlns="8b0498ea-4bc6-4676-a87b-9cffe7f59fc7" xsi:nil="true"/>
+    <FECHAYHORA xmlns="8b0498ea-4bc6-4676-a87b-9cffe7f59fc7" xsi:nil="true"/>
+    <Entregado xmlns="8b0498ea-4bc6-4676-a87b-9cffe7f59fc7">false</Entregado>
+    <Asignado xmlns="8b0498ea-4bc6-4676-a87b-9cffe7f59fc7">true</Asignado>
+    <Observado xmlns="8b0498ea-4bc6-4676-a87b-9cffe7f59fc7">false</Observado>
+    <Virtualizado xmlns="8b0498ea-4bc6-4676-a87b-9cffe7f59fc7">false</Virtualizado>
+    <SharedWithUsers xmlns="ee27a0f9-7ff9-4c05-b61a-f7053cc3ff56">
+      <UserInfo>
+        <DisplayName/>
+        <AccountId xsi:nil="true"/>
+        <AccountType/>
+      </UserInfo>
+    </SharedWithUsers>
+  </documentManagement>
+</p:properties>
 </file>
 
 <file path=customXml/item2.xml><?xml version="1.0" encoding="utf-8"?>
@@ -26654,31 +26669,12 @@
 </file>
 
 <file path=customXml/item3.xml><?xml version="1.0" encoding="utf-8"?>
-<p:properties xmlns:p="http://schemas.microsoft.com/office/2006/metadata/properties" xmlns:xsi="http://www.w3.org/2001/XMLSchema-instance" xmlns:pc="http://schemas.microsoft.com/office/infopath/2007/PartnerControls">
-  <documentManagement>
-    <TaxCatchAll xmlns="ee27a0f9-7ff9-4c05-b61a-f7053cc3ff56" xsi:nil="true"/>
-    <lcf76f155ced4ddcb4097134ff3c332f xmlns="8b0498ea-4bc6-4676-a87b-9cffe7f59fc7">
-      <Terms xmlns="http://schemas.microsoft.com/office/infopath/2007/PartnerControls"/>
-    </lcf76f155ced4ddcb4097134ff3c332f>
-    <Validado xmlns="8b0498ea-4bc6-4676-a87b-9cffe7f59fc7">false</Validado>
-    <Tarea3 xmlns="8b0498ea-4bc6-4676-a87b-9cffe7f59fc7" xsi:nil="true"/>
-    <NumTareas xmlns="8b0498ea-4bc6-4676-a87b-9cffe7f59fc7" xsi:nil="true"/>
-    <Maquetado xmlns="8b0498ea-4bc6-4676-a87b-9cffe7f59fc7">false</Maquetado>
-    <Validado_v2 xmlns="8b0498ea-4bc6-4676-a87b-9cffe7f59fc7" xsi:nil="true"/>
-    <FECHAYHORA xmlns="8b0498ea-4bc6-4676-a87b-9cffe7f59fc7" xsi:nil="true"/>
-    <Entregado xmlns="8b0498ea-4bc6-4676-a87b-9cffe7f59fc7">false</Entregado>
-    <Asignado xmlns="8b0498ea-4bc6-4676-a87b-9cffe7f59fc7">true</Asignado>
-    <Observado xmlns="8b0498ea-4bc6-4676-a87b-9cffe7f59fc7">false</Observado>
-    <Virtualizado xmlns="8b0498ea-4bc6-4676-a87b-9cffe7f59fc7">false</Virtualizado>
-    <SharedWithUsers xmlns="ee27a0f9-7ff9-4c05-b61a-f7053cc3ff56">
-      <UserInfo>
-        <DisplayName/>
-        <AccountId xsi:nil="true"/>
-        <AccountType/>
-      </UserInfo>
-    </SharedWithUsers>
-  </documentManagement>
-</p:properties>
+<?mso-contentType ?>
+<FormTemplates xmlns="http://schemas.microsoft.com/sharepoint/v3/contenttype/forms">
+  <Display>DocumentLibraryForm</Display>
+  <Edit>DocumentLibraryForm</Edit>
+  <New>DocumentLibraryForm</New>
+</FormTemplates>
 </file>
 
 <file path=customXml/item4.xml><?xml version="1.0" encoding="utf-8"?>
@@ -26686,9 +26682,12 @@
 </file>
 
 <file path=customXml/itemProps1.xml><?xml version="1.0" encoding="utf-8"?>
-<ds:datastoreItem xmlns:ds="http://schemas.openxmlformats.org/officeDocument/2006/customXml" ds:itemID="{21DA1112-85AB-4ED2-BDE2-25A2490B57E1}">
+<ds:datastoreItem xmlns:ds="http://schemas.openxmlformats.org/officeDocument/2006/customXml" ds:itemID="{8B365F48-C2B5-4E3D-BA44-D9D74DBA7350}">
   <ds:schemaRefs>
-    <ds:schemaRef ds:uri="http://schemas.microsoft.com/sharepoint/v3/contenttype/forms"/>
+    <ds:schemaRef ds:uri="http://schemas.microsoft.com/office/2006/metadata/properties"/>
+    <ds:schemaRef ds:uri="http://schemas.microsoft.com/office/infopath/2007/PartnerControls"/>
+    <ds:schemaRef ds:uri="ee27a0f9-7ff9-4c05-b61a-f7053cc3ff56"/>
+    <ds:schemaRef ds:uri="8b0498ea-4bc6-4676-a87b-9cffe7f59fc7"/>
   </ds:schemaRefs>
 </ds:datastoreItem>
 </file>
@@ -26713,18 +26712,15 @@
 </file>
 
 <file path=customXml/itemProps3.xml><?xml version="1.0" encoding="utf-8"?>
-<ds:datastoreItem xmlns:ds="http://schemas.openxmlformats.org/officeDocument/2006/customXml" ds:itemID="{8B365F48-C2B5-4E3D-BA44-D9D74DBA7350}">
+<ds:datastoreItem xmlns:ds="http://schemas.openxmlformats.org/officeDocument/2006/customXml" ds:itemID="{21DA1112-85AB-4ED2-BDE2-25A2490B57E1}">
   <ds:schemaRefs>
-    <ds:schemaRef ds:uri="http://schemas.microsoft.com/office/2006/metadata/properties"/>
-    <ds:schemaRef ds:uri="http://schemas.microsoft.com/office/infopath/2007/PartnerControls"/>
-    <ds:schemaRef ds:uri="ee27a0f9-7ff9-4c05-b61a-f7053cc3ff56"/>
-    <ds:schemaRef ds:uri="8b0498ea-4bc6-4676-a87b-9cffe7f59fc7"/>
+    <ds:schemaRef ds:uri="http://schemas.microsoft.com/sharepoint/v3/contenttype/forms"/>
   </ds:schemaRefs>
 </ds:datastoreItem>
 </file>
 
 <file path=customXml/itemProps4.xml><?xml version="1.0" encoding="utf-8"?>
-<ds:datastoreItem xmlns:ds="http://schemas.openxmlformats.org/officeDocument/2006/customXml" ds:itemID="{364C03D7-540B-4E1B-89B0-EFDCFE6737B4}">
+<ds:datastoreItem xmlns:ds="http://schemas.openxmlformats.org/officeDocument/2006/customXml" ds:itemID="{6F49073C-3855-4E57-9CBA-5F69B75A20BC}">
   <ds:schemaRefs>
     <ds:schemaRef ds:uri="http://schemas.openxmlformats.org/officeDocument/2006/bibliography"/>
   </ds:schemaRefs>

</xml_diff>

<commit_message>
update practica01 & add practica02
</commit_message>
<xml_diff>
--- a/informe practica 01.docx
+++ b/informe practica 01.docx
@@ -90,7 +90,7 @@
               </wp:anchor>
             </w:drawing>
           </mc:Choice>
-          <mc:Fallback xmlns:oel="http://schemas.microsoft.com/office/2019/extlst" xmlns:w16cex="http://schemas.microsoft.com/office/word/2018/wordml/cex" xmlns:w16="http://schemas.microsoft.com/office/word/2018/wordml" xmlns:w16du="http://schemas.microsoft.com/office/word/2023/wordml/word16du" xmlns:w16sdtdh="http://schemas.microsoft.com/office/word/2020/wordml/sdtdatahash" xmlns:w16sdtfl="http://schemas.microsoft.com/office/word/2024/wordml/sdtformatlock">
+          <mc:Fallback xmlns:w16sdtfl="http://schemas.microsoft.com/office/word/2024/wordml/sdtformatlock" xmlns:w16sdtdh="http://schemas.microsoft.com/office/word/2020/wordml/sdtdatahash" xmlns:w16du="http://schemas.microsoft.com/office/word/2023/wordml/word16du" xmlns:w16="http://schemas.microsoft.com/office/word/2018/wordml" xmlns:w16cex="http://schemas.microsoft.com/office/word/2018/wordml/cex" xmlns:oel="http://schemas.microsoft.com/office/2019/extlst">
             <w:pict>
               <v:line w14:anchorId="79000A9E" id="Conector recto 11" o:spid="_x0000_s1026" style="position:absolute;flip:y;z-index:251662336;visibility:visible;mso-wrap-style:square;mso-width-percent:0;mso-height-percent:0;mso-wrap-distance-left:9pt;mso-wrap-distance-top:0;mso-wrap-distance-right:9pt;mso-wrap-distance-bottom:0;mso-position-horizontal:absolute;mso-position-horizontal-relative:text;mso-position-vertical:absolute;mso-position-vertical-relative:text;mso-width-percent:0;mso-height-percent:0;mso-width-relative:page;mso-height-relative:page" from="0,9.45pt" to="495pt,9.45pt" o:gfxdata="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" o:allowincell="f" strokeweight="4.5pt">
                 <v:stroke linestyle="thickThin"/>
@@ -444,7 +444,7 @@
               </wp:anchor>
             </w:drawing>
           </mc:Choice>
-          <mc:Fallback xmlns:oel="http://schemas.microsoft.com/office/2019/extlst" xmlns:w16cex="http://schemas.microsoft.com/office/word/2018/wordml/cex" xmlns:w16="http://schemas.microsoft.com/office/word/2018/wordml" xmlns:w16du="http://schemas.microsoft.com/office/word/2023/wordml/word16du" xmlns:w16sdtdh="http://schemas.microsoft.com/office/word/2020/wordml/sdtdatahash" xmlns:w16sdtfl="http://schemas.microsoft.com/office/word/2024/wordml/sdtformatlock">
+          <mc:Fallback xmlns:w16sdtfl="http://schemas.microsoft.com/office/word/2024/wordml/sdtformatlock" xmlns:w16sdtdh="http://schemas.microsoft.com/office/word/2020/wordml/sdtdatahash" xmlns:w16du="http://schemas.microsoft.com/office/word/2023/wordml/word16du" xmlns:w16="http://schemas.microsoft.com/office/word/2018/wordml" xmlns:w16cex="http://schemas.microsoft.com/office/word/2018/wordml/cex" xmlns:oel="http://schemas.microsoft.com/office/2019/extlst">
             <w:pict>
               <v:shapetype w14:anchorId="23E962EA" id="_x0000_t66" coordsize="21600,21600" o:spt="66" adj="5400,5400" path="m@0,l@0@1,21600@1,21600@2@0@2@0,21600,,10800xe">
                 <v:stroke joinstyle="miter"/>
@@ -542,7 +542,7 @@
               </wp:anchor>
             </w:drawing>
           </mc:Choice>
-          <mc:Fallback xmlns:oel="http://schemas.microsoft.com/office/2019/extlst" xmlns:w16cex="http://schemas.microsoft.com/office/word/2018/wordml/cex" xmlns:w16="http://schemas.microsoft.com/office/word/2018/wordml" xmlns:w16du="http://schemas.microsoft.com/office/word/2023/wordml/word16du" xmlns:w16sdtdh="http://schemas.microsoft.com/office/word/2020/wordml/sdtdatahash" xmlns:w16sdtfl="http://schemas.microsoft.com/office/word/2024/wordml/sdtformatlock">
+          <mc:Fallback xmlns:w16sdtfl="http://schemas.microsoft.com/office/word/2024/wordml/sdtformatlock" xmlns:w16sdtdh="http://schemas.microsoft.com/office/word/2020/wordml/sdtdatahash" xmlns:w16du="http://schemas.microsoft.com/office/word/2023/wordml/word16du" xmlns:w16="http://schemas.microsoft.com/office/word/2018/wordml" xmlns:w16cex="http://schemas.microsoft.com/office/word/2018/wordml/cex" xmlns:oel="http://schemas.microsoft.com/office/2019/extlst">
             <w:pict>
               <v:shapetype w14:anchorId="001D26AC" id="_x0000_t13" coordsize="21600,21600" o:spt="13" adj="16200,5400" path="m@0,l@0@1,0@1,0@2@0@2@0,21600,21600,10800xe">
                 <v:stroke joinstyle="miter"/>
@@ -22470,6 +22470,132 @@
         </w:tabs>
         <w:spacing w:line="360" w:lineRule="auto"/>
         <w:rPr>
+          <w:b w:val="0"/>
+          <w:bCs w:val="0"/>
+          <w:sz w:val="22"/>
+          <w:lang w:val="es-MX"/>
+        </w:rPr>
+      </w:pPr>
+    </w:p>
+    <w:p>
+      <w:pPr>
+        <w:tabs>
+          <w:tab w:val="left" w:leader="underscore" w:pos="9700"/>
+        </w:tabs>
+        <w:spacing w:line="360" w:lineRule="auto"/>
+        <w:rPr>
+          <w:b w:val="0"/>
+          <w:bCs w:val="0"/>
+          <w:sz w:val="22"/>
+          <w:lang w:val="es-MX"/>
+        </w:rPr>
+      </w:pPr>
+    </w:p>
+    <w:p>
+      <w:pPr>
+        <w:tabs>
+          <w:tab w:val="left" w:leader="underscore" w:pos="9700"/>
+        </w:tabs>
+        <w:spacing w:line="360" w:lineRule="auto"/>
+        <w:rPr>
+          <w:b w:val="0"/>
+          <w:bCs w:val="0"/>
+          <w:sz w:val="22"/>
+          <w:lang w:val="es-MX"/>
+        </w:rPr>
+      </w:pPr>
+    </w:p>
+    <w:p>
+      <w:pPr>
+        <w:tabs>
+          <w:tab w:val="left" w:leader="underscore" w:pos="9700"/>
+        </w:tabs>
+        <w:spacing w:line="360" w:lineRule="auto"/>
+        <w:rPr>
+          <w:b w:val="0"/>
+          <w:bCs w:val="0"/>
+          <w:sz w:val="22"/>
+          <w:lang w:val="es-MX"/>
+        </w:rPr>
+      </w:pPr>
+    </w:p>
+    <w:p>
+      <w:pPr>
+        <w:tabs>
+          <w:tab w:val="left" w:leader="underscore" w:pos="9700"/>
+        </w:tabs>
+        <w:spacing w:line="360" w:lineRule="auto"/>
+        <w:rPr>
+          <w:b w:val="0"/>
+          <w:bCs w:val="0"/>
+          <w:sz w:val="22"/>
+          <w:lang w:val="es-MX"/>
+        </w:rPr>
+      </w:pPr>
+    </w:p>
+    <w:p>
+      <w:pPr>
+        <w:tabs>
+          <w:tab w:val="left" w:leader="underscore" w:pos="9700"/>
+        </w:tabs>
+        <w:spacing w:line="360" w:lineRule="auto"/>
+        <w:rPr>
+          <w:b w:val="0"/>
+          <w:bCs w:val="0"/>
+          <w:sz w:val="22"/>
+          <w:lang w:val="es-MX"/>
+        </w:rPr>
+      </w:pPr>
+    </w:p>
+    <w:p>
+      <w:pPr>
+        <w:tabs>
+          <w:tab w:val="left" w:leader="underscore" w:pos="9700"/>
+        </w:tabs>
+        <w:spacing w:line="360" w:lineRule="auto"/>
+        <w:rPr>
+          <w:b w:val="0"/>
+          <w:bCs w:val="0"/>
+          <w:sz w:val="22"/>
+          <w:lang w:val="es-MX"/>
+        </w:rPr>
+      </w:pPr>
+    </w:p>
+    <w:p>
+      <w:pPr>
+        <w:tabs>
+          <w:tab w:val="left" w:leader="underscore" w:pos="9700"/>
+        </w:tabs>
+        <w:spacing w:line="360" w:lineRule="auto"/>
+        <w:rPr>
+          <w:b w:val="0"/>
+          <w:bCs w:val="0"/>
+          <w:sz w:val="22"/>
+          <w:lang w:val="es-MX"/>
+        </w:rPr>
+      </w:pPr>
+    </w:p>
+    <w:p>
+      <w:pPr>
+        <w:tabs>
+          <w:tab w:val="left" w:leader="underscore" w:pos="9700"/>
+        </w:tabs>
+        <w:spacing w:line="360" w:lineRule="auto"/>
+        <w:rPr>
+          <w:b w:val="0"/>
+          <w:bCs w:val="0"/>
+          <w:sz w:val="22"/>
+          <w:lang w:val="es-MX"/>
+        </w:rPr>
+      </w:pPr>
+    </w:p>
+    <w:p>
+      <w:pPr>
+        <w:tabs>
+          <w:tab w:val="left" w:leader="underscore" w:pos="9700"/>
+        </w:tabs>
+        <w:spacing w:line="360" w:lineRule="auto"/>
+        <w:rPr>
           <w:bCs w:val="0"/>
           <w:sz w:val="22"/>
           <w:lang w:val="es-MX"/>
@@ -22555,6 +22681,15 @@
           <w:lang w:val="es-MX"/>
         </w:rPr>
       </w:pPr>
+      <w:r>
+        <w:rPr>
+          <w:b w:val="0"/>
+          <w:bCs w:val="0"/>
+          <w:sz w:val="22"/>
+          <w:lang w:val="es-MX"/>
+        </w:rPr>
+        <w:t>Asimismo, se promovió la limpieza y el orden en el área de trabajo para reducir riesgos de accidentes, junto con la adecuada disposición de residuos según el Sistema de Gestión Ambiental (SGA). Se mantuvo la zona con buena ventilación y se recomendó el uso de posturas ergonómicas durante las labores.</w:t>
+      </w:r>
     </w:p>
     <w:p>
       <w:pPr>
@@ -22590,7 +22725,7 @@
           <w:sz w:val="22"/>
           <w:lang w:val="es-MX"/>
         </w:rPr>
-        <w:t>Asimismo, se promovió la limpieza y el orden en el área de trabajo para reducir riesgos de accidentes, junto con la adecuada disposición de residuos según el Sistema de Gestión Ambiental (SGA). Se mantuvo la zona con buena ventilación y se recomendó el uso de posturas ergonómicas durante las labores.</w:t>
+        <w:t>Finalmente, se resaltó la importancia de la cultura preventiva, fomentando pausas activas, hidratación constante y comunicación efectiva entre los miembros del equipo para garantizar un ambiente laboral seguro y saludable.</w:t>
       </w:r>
     </w:p>
     <w:p>
@@ -22600,7 +22735,6 @@
         </w:tabs>
         <w:spacing w:line="360" w:lineRule="auto"/>
         <w:rPr>
-          <w:b w:val="0"/>
           <w:bCs w:val="0"/>
           <w:sz w:val="22"/>
           <w:lang w:val="es-MX"/>
@@ -22614,7 +22748,6 @@
         </w:tabs>
         <w:spacing w:line="360" w:lineRule="auto"/>
         <w:rPr>
-          <w:b w:val="0"/>
           <w:bCs w:val="0"/>
           <w:sz w:val="22"/>
           <w:lang w:val="es-MX"/>
@@ -22622,12 +22755,19 @@
       </w:pPr>
       <w:r>
         <w:rPr>
-          <w:b w:val="0"/>
           <w:bCs w:val="0"/>
           <w:sz w:val="22"/>
           <w:lang w:val="es-MX"/>
         </w:rPr>
-        <w:t>Finalmente, se resaltó la importancia de la cultura preventiva, fomentando pausas activas, hidratación constante y comunicación efectiva entre los miembros del equipo para garantizar un ambiente laboral seguro y saludable.</w:t>
+        <w:t>Resultados de la ejecución de la tarea/Recomendaciones</w:t>
+      </w:r>
+      <w:r>
+        <w:rPr>
+          <w:bCs w:val="0"/>
+          <w:sz w:val="22"/>
+          <w:lang w:val="es-MX"/>
+        </w:rPr>
+        <w:t xml:space="preserve"> (¿Se logró el objetivo que motivó la ejecución de la tarea? Qué recomendaciones sugiere para garantizar la operatividad del bien o servicio realizado</w:t>
       </w:r>
     </w:p>
     <w:p>
@@ -22637,9 +22777,9 @@
         </w:tabs>
         <w:spacing w:line="360" w:lineRule="auto"/>
         <w:rPr>
-          <w:bCs w:val="0"/>
-          <w:sz w:val="22"/>
-          <w:lang w:val="es-MX"/>
+          <w:b w:val="0"/>
+          <w:sz w:val="22"/>
+          <w:lang w:val="es-PE"/>
         </w:rPr>
       </w:pPr>
     </w:p>
@@ -22650,11 +22790,37 @@
         </w:tabs>
         <w:spacing w:line="360" w:lineRule="auto"/>
         <w:rPr>
-          <w:bCs w:val="0"/>
-          <w:sz w:val="22"/>
-          <w:lang w:val="es-MX"/>
-        </w:rPr>
-      </w:pPr>
+          <w:b w:val="0"/>
+          <w:sz w:val="22"/>
+          <w:lang w:val="es-PE"/>
+        </w:rPr>
+      </w:pPr>
+      <w:r>
+        <w:rPr>
+          <w:b w:val="0"/>
+          <w:sz w:val="22"/>
+          <w:lang w:val="es-PE"/>
+        </w:rPr>
+        <w:t xml:space="preserve">Sí, logré cumplir con el objetivo de la tarea, ya que pude elaborar de manera correcta el mapa conceptual sobre los principales conceptos de Big Data, organizando la información de forma clara y visual. Me sentí satisfecho con el resultado porque logré representar no solo la definición general, sino también las 5 </w:t>
+      </w:r>
+      <w:proofErr w:type="spellStart"/>
+      <w:r>
+        <w:rPr>
+          <w:b w:val="0"/>
+          <w:sz w:val="22"/>
+          <w:lang w:val="es-PE"/>
+        </w:rPr>
+        <w:t>V’s</w:t>
+      </w:r>
+      <w:proofErr w:type="spellEnd"/>
+      <w:r>
+        <w:rPr>
+          <w:b w:val="0"/>
+          <w:sz w:val="22"/>
+          <w:lang w:val="es-PE"/>
+        </w:rPr>
+        <w:t xml:space="preserve"> (Volumen, Velocidad, Variedad, Veracidad y Valor) y sus aplicaciones prácticas. Esto me permitió comprender mejor las relaciones entre los conceptos y reforzar mi aprendizaje.</w:t>
+      </w:r>
     </w:p>
     <w:p>
       <w:pPr>
@@ -22663,27 +22829,11 @@
         </w:tabs>
         <w:spacing w:line="360" w:lineRule="auto"/>
         <w:rPr>
-          <w:bCs w:val="0"/>
-          <w:sz w:val="22"/>
-          <w:lang w:val="es-MX"/>
-        </w:rPr>
-      </w:pPr>
-      <w:r>
-        <w:rPr>
-          <w:bCs w:val="0"/>
-          <w:sz w:val="22"/>
-          <w:lang w:val="es-MX"/>
-        </w:rPr>
-        <w:t>Resultados de la ejecución de la tarea/Recomendaciones</w:t>
-      </w:r>
-      <w:r>
-        <w:rPr>
-          <w:bCs w:val="0"/>
-          <w:sz w:val="22"/>
-          <w:lang w:val="es-MX"/>
-        </w:rPr>
-        <w:t xml:space="preserve"> (¿Se logró el objetivo que motivó la ejecución de la tarea? Qué recomendaciones sugiere para garantizar la operatividad del bien o servicio realizado</w:t>
-      </w:r>
+          <w:b w:val="0"/>
+          <w:sz w:val="22"/>
+          <w:lang w:val="es-PE"/>
+        </w:rPr>
+      </w:pPr>
     </w:p>
     <w:p>
       <w:pPr>
@@ -22693,83 +22843,22 @@
         <w:spacing w:line="360" w:lineRule="auto"/>
         <w:rPr>
           <w:b w:val="0"/>
+          <w:i/>
           <w:sz w:val="22"/>
           <w:lang w:val="es-PE"/>
         </w:rPr>
       </w:pPr>
-    </w:p>
-    <w:p>
-      <w:pPr>
-        <w:tabs>
-          <w:tab w:val="left" w:leader="underscore" w:pos="9700"/>
-        </w:tabs>
-        <w:spacing w:line="360" w:lineRule="auto"/>
-        <w:rPr>
-          <w:b w:val="0"/>
-          <w:sz w:val="22"/>
-          <w:lang w:val="es-PE"/>
-        </w:rPr>
-      </w:pPr>
       <w:r>
         <w:rPr>
           <w:b w:val="0"/>
-          <w:sz w:val="22"/>
-          <w:lang w:val="es-PE"/>
-        </w:rPr>
-        <w:t xml:space="preserve">Sí, logré cumplir con el objetivo de la tarea, ya que pude elaborar de manera correcta el mapa conceptual sobre los principales conceptos de Big Data, organizando la información de forma clara y visual. Me sentí satisfecho con el resultado porque logré representar no solo la definición general, sino también las 5 </w:t>
-      </w:r>
-      <w:proofErr w:type="spellStart"/>
-      <w:r>
-        <w:rPr>
-          <w:b w:val="0"/>
-          <w:sz w:val="22"/>
-          <w:lang w:val="es-PE"/>
-        </w:rPr>
-        <w:t>V’s</w:t>
-      </w:r>
-      <w:proofErr w:type="spellEnd"/>
-      <w:r>
-        <w:rPr>
-          <w:b w:val="0"/>
-          <w:sz w:val="22"/>
-          <w:lang w:val="es-PE"/>
-        </w:rPr>
-        <w:t xml:space="preserve"> (Volumen, Velocidad, Variedad, Veracidad y Valor) y sus aplicaciones prácticas. Esto me permitió comprender mejor las relaciones entre los conceptos y reforzar mi aprendizaje.</w:t>
-      </w:r>
-    </w:p>
-    <w:p>
-      <w:pPr>
-        <w:tabs>
-          <w:tab w:val="left" w:leader="underscore" w:pos="9700"/>
-        </w:tabs>
-        <w:spacing w:line="360" w:lineRule="auto"/>
-        <w:rPr>
-          <w:b w:val="0"/>
-          <w:sz w:val="22"/>
-          <w:lang w:val="es-PE"/>
-        </w:rPr>
-      </w:pPr>
-    </w:p>
-    <w:p>
-      <w:pPr>
-        <w:tabs>
-          <w:tab w:val="left" w:leader="underscore" w:pos="9700"/>
-        </w:tabs>
-        <w:spacing w:line="360" w:lineRule="auto"/>
-        <w:rPr>
-          <w:b w:val="0"/>
-          <w:sz w:val="22"/>
-          <w:lang w:val="es-PE"/>
-        </w:rPr>
-      </w:pPr>
-      <w:r>
-        <w:rPr>
-          <w:b w:val="0"/>
+          <w:i/>
           <w:sz w:val="22"/>
           <w:lang w:val="es-PE"/>
         </w:rPr>
         <w:t>Otras recomendaciones:</w:t>
       </w:r>
+      <w:bookmarkStart w:id="0" w:name="_GoBack"/>
+      <w:bookmarkEnd w:id="0"/>
     </w:p>
     <w:p>
       <w:pPr>
@@ -22928,68 +23017,6 @@
         </w:rPr>
         <w:t>Revisar constantemente la coherencia y la ortografía, garantizando que el esquema cumpla su función como herramienta de estudio.</w:t>
       </w:r>
-    </w:p>
-    <w:p>
-      <w:pPr>
-        <w:spacing w:line="360" w:lineRule="auto"/>
-        <w:ind w:right="-1135"/>
-        <w:rPr>
-          <w:sz w:val="22"/>
-          <w:lang w:val="es-MX"/>
-        </w:rPr>
-      </w:pPr>
-    </w:p>
-    <w:p>
-      <w:pPr>
-        <w:spacing w:line="360" w:lineRule="auto"/>
-        <w:ind w:right="-1135"/>
-        <w:rPr>
-          <w:sz w:val="22"/>
-          <w:lang w:val="es-MX"/>
-        </w:rPr>
-      </w:pPr>
-    </w:p>
-    <w:p>
-      <w:pPr>
-        <w:spacing w:line="360" w:lineRule="auto"/>
-        <w:ind w:right="-1135"/>
-        <w:rPr>
-          <w:sz w:val="22"/>
-          <w:lang w:val="es-MX"/>
-        </w:rPr>
-      </w:pPr>
-    </w:p>
-    <w:p>
-      <w:pPr>
-        <w:spacing w:line="360" w:lineRule="auto"/>
-        <w:ind w:right="-1135"/>
-        <w:rPr>
-          <w:sz w:val="22"/>
-          <w:lang w:val="es-MX"/>
-        </w:rPr>
-      </w:pPr>
-    </w:p>
-    <w:p>
-      <w:pPr>
-        <w:spacing w:line="360" w:lineRule="auto"/>
-        <w:ind w:right="-1135"/>
-        <w:rPr>
-          <w:sz w:val="22"/>
-          <w:lang w:val="es-MX"/>
-        </w:rPr>
-      </w:pPr>
-    </w:p>
-    <w:p>
-      <w:pPr>
-        <w:spacing w:line="360" w:lineRule="auto"/>
-        <w:ind w:right="-1135"/>
-        <w:rPr>
-          <w:sz w:val="22"/>
-          <w:lang w:val="es-MX"/>
-        </w:rPr>
-      </w:pPr>
-      <w:bookmarkStart w:id="0" w:name="_GoBack"/>
-      <w:bookmarkEnd w:id="0"/>
     </w:p>
     <w:tbl>
       <w:tblPr>
@@ -23220,7 +23247,7 @@
                     </wp:anchor>
                   </w:drawing>
                 </mc:Choice>
-                <mc:Fallback xmlns:oel="http://schemas.microsoft.com/office/2019/extlst" xmlns:w16cex="http://schemas.microsoft.com/office/word/2018/wordml/cex" xmlns:w16="http://schemas.microsoft.com/office/word/2018/wordml" xmlns:w16du="http://schemas.microsoft.com/office/word/2023/wordml/word16du" xmlns:w16sdtdh="http://schemas.microsoft.com/office/word/2020/wordml/sdtdatahash" xmlns:w16sdtfl="http://schemas.microsoft.com/office/word/2024/wordml/sdtformatlock">
+                <mc:Fallback xmlns:w16sdtfl="http://schemas.microsoft.com/office/word/2024/wordml/sdtformatlock" xmlns:w16sdtdh="http://schemas.microsoft.com/office/word/2020/wordml/sdtdatahash" xmlns:w16du="http://schemas.microsoft.com/office/word/2023/wordml/word16du" xmlns:w16="http://schemas.microsoft.com/office/word/2018/wordml" xmlns:w16cex="http://schemas.microsoft.com/office/word/2018/wordml/cex" xmlns:oel="http://schemas.microsoft.com/office/2019/extlst">
                   <w:pict>
                     <v:rect w14:anchorId="18B09586" id="Rectángulo 9" o:spid="_x0000_s1026" style="position:absolute;margin-left:456.15pt;margin-top:4.25pt;width:44.65pt;height:25.85pt;z-index:251674624;visibility:visible;mso-wrap-style:square;mso-wrap-distance-left:9pt;mso-wrap-distance-top:0;mso-wrap-distance-right:9pt;mso-wrap-distance-bottom:0;mso-position-horizontal:absolute;mso-position-horizontal-relative:text;mso-position-vertical:absolute;mso-position-vertical-relative:text;v-text-anchor:middle" o:gfxdata="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" filled="f" strokecolor="#09101d [484]" strokeweight="1pt"/>
                   </w:pict>
@@ -26317,31 +26344,12 @@
 </file>
 
 <file path=customXml/item1.xml><?xml version="1.0" encoding="utf-8"?>
-<p:properties xmlns:p="http://schemas.microsoft.com/office/2006/metadata/properties" xmlns:xsi="http://www.w3.org/2001/XMLSchema-instance" xmlns:pc="http://schemas.microsoft.com/office/infopath/2007/PartnerControls">
-  <documentManagement>
-    <TaxCatchAll xmlns="ee27a0f9-7ff9-4c05-b61a-f7053cc3ff56" xsi:nil="true"/>
-    <lcf76f155ced4ddcb4097134ff3c332f xmlns="8b0498ea-4bc6-4676-a87b-9cffe7f59fc7">
-      <Terms xmlns="http://schemas.microsoft.com/office/infopath/2007/PartnerControls"/>
-    </lcf76f155ced4ddcb4097134ff3c332f>
-    <Validado xmlns="8b0498ea-4bc6-4676-a87b-9cffe7f59fc7">false</Validado>
-    <Tarea3 xmlns="8b0498ea-4bc6-4676-a87b-9cffe7f59fc7" xsi:nil="true"/>
-    <NumTareas xmlns="8b0498ea-4bc6-4676-a87b-9cffe7f59fc7" xsi:nil="true"/>
-    <Maquetado xmlns="8b0498ea-4bc6-4676-a87b-9cffe7f59fc7">false</Maquetado>
-    <Validado_v2 xmlns="8b0498ea-4bc6-4676-a87b-9cffe7f59fc7" xsi:nil="true"/>
-    <FECHAYHORA xmlns="8b0498ea-4bc6-4676-a87b-9cffe7f59fc7" xsi:nil="true"/>
-    <Entregado xmlns="8b0498ea-4bc6-4676-a87b-9cffe7f59fc7">false</Entregado>
-    <Asignado xmlns="8b0498ea-4bc6-4676-a87b-9cffe7f59fc7">true</Asignado>
-    <Observado xmlns="8b0498ea-4bc6-4676-a87b-9cffe7f59fc7">false</Observado>
-    <Virtualizado xmlns="8b0498ea-4bc6-4676-a87b-9cffe7f59fc7">false</Virtualizado>
-    <SharedWithUsers xmlns="ee27a0f9-7ff9-4c05-b61a-f7053cc3ff56">
-      <UserInfo>
-        <DisplayName/>
-        <AccountId xsi:nil="true"/>
-        <AccountType/>
-      </UserInfo>
-    </SharedWithUsers>
-  </documentManagement>
-</p:properties>
+<?mso-contentType ?>
+<FormTemplates xmlns="http://schemas.microsoft.com/sharepoint/v3/contenttype/forms">
+  <Display>DocumentLibraryForm</Display>
+  <Edit>DocumentLibraryForm</Edit>
+  <New>DocumentLibraryForm</New>
+</FormTemplates>
 </file>
 
 <file path=customXml/item2.xml><?xml version="1.0" encoding="utf-8"?>
@@ -26669,12 +26677,31 @@
 </file>
 
 <file path=customXml/item3.xml><?xml version="1.0" encoding="utf-8"?>
-<?mso-contentType ?>
-<FormTemplates xmlns="http://schemas.microsoft.com/sharepoint/v3/contenttype/forms">
-  <Display>DocumentLibraryForm</Display>
-  <Edit>DocumentLibraryForm</Edit>
-  <New>DocumentLibraryForm</New>
-</FormTemplates>
+<p:properties xmlns:p="http://schemas.microsoft.com/office/2006/metadata/properties" xmlns:xsi="http://www.w3.org/2001/XMLSchema-instance" xmlns:pc="http://schemas.microsoft.com/office/infopath/2007/PartnerControls">
+  <documentManagement>
+    <TaxCatchAll xmlns="ee27a0f9-7ff9-4c05-b61a-f7053cc3ff56" xsi:nil="true"/>
+    <lcf76f155ced4ddcb4097134ff3c332f xmlns="8b0498ea-4bc6-4676-a87b-9cffe7f59fc7">
+      <Terms xmlns="http://schemas.microsoft.com/office/infopath/2007/PartnerControls"/>
+    </lcf76f155ced4ddcb4097134ff3c332f>
+    <Validado xmlns="8b0498ea-4bc6-4676-a87b-9cffe7f59fc7">false</Validado>
+    <Tarea3 xmlns="8b0498ea-4bc6-4676-a87b-9cffe7f59fc7" xsi:nil="true"/>
+    <NumTareas xmlns="8b0498ea-4bc6-4676-a87b-9cffe7f59fc7" xsi:nil="true"/>
+    <Maquetado xmlns="8b0498ea-4bc6-4676-a87b-9cffe7f59fc7">false</Maquetado>
+    <Validado_v2 xmlns="8b0498ea-4bc6-4676-a87b-9cffe7f59fc7" xsi:nil="true"/>
+    <FECHAYHORA xmlns="8b0498ea-4bc6-4676-a87b-9cffe7f59fc7" xsi:nil="true"/>
+    <Entregado xmlns="8b0498ea-4bc6-4676-a87b-9cffe7f59fc7">false</Entregado>
+    <Asignado xmlns="8b0498ea-4bc6-4676-a87b-9cffe7f59fc7">true</Asignado>
+    <Observado xmlns="8b0498ea-4bc6-4676-a87b-9cffe7f59fc7">false</Observado>
+    <Virtualizado xmlns="8b0498ea-4bc6-4676-a87b-9cffe7f59fc7">false</Virtualizado>
+    <SharedWithUsers xmlns="ee27a0f9-7ff9-4c05-b61a-f7053cc3ff56">
+      <UserInfo>
+        <DisplayName/>
+        <AccountId xsi:nil="true"/>
+        <AccountType/>
+      </UserInfo>
+    </SharedWithUsers>
+  </documentManagement>
+</p:properties>
 </file>
 
 <file path=customXml/item4.xml><?xml version="1.0" encoding="utf-8"?>
@@ -26682,12 +26709,9 @@
 </file>
 
 <file path=customXml/itemProps1.xml><?xml version="1.0" encoding="utf-8"?>
-<ds:datastoreItem xmlns:ds="http://schemas.openxmlformats.org/officeDocument/2006/customXml" ds:itemID="{8B365F48-C2B5-4E3D-BA44-D9D74DBA7350}">
+<ds:datastoreItem xmlns:ds="http://schemas.openxmlformats.org/officeDocument/2006/customXml" ds:itemID="{21DA1112-85AB-4ED2-BDE2-25A2490B57E1}">
   <ds:schemaRefs>
-    <ds:schemaRef ds:uri="http://schemas.microsoft.com/office/2006/metadata/properties"/>
-    <ds:schemaRef ds:uri="http://schemas.microsoft.com/office/infopath/2007/PartnerControls"/>
-    <ds:schemaRef ds:uri="ee27a0f9-7ff9-4c05-b61a-f7053cc3ff56"/>
-    <ds:schemaRef ds:uri="8b0498ea-4bc6-4676-a87b-9cffe7f59fc7"/>
+    <ds:schemaRef ds:uri="http://schemas.microsoft.com/sharepoint/v3/contenttype/forms"/>
   </ds:schemaRefs>
 </ds:datastoreItem>
 </file>
@@ -26712,15 +26736,18 @@
 </file>
 
 <file path=customXml/itemProps3.xml><?xml version="1.0" encoding="utf-8"?>
-<ds:datastoreItem xmlns:ds="http://schemas.openxmlformats.org/officeDocument/2006/customXml" ds:itemID="{21DA1112-85AB-4ED2-BDE2-25A2490B57E1}">
+<ds:datastoreItem xmlns:ds="http://schemas.openxmlformats.org/officeDocument/2006/customXml" ds:itemID="{8B365F48-C2B5-4E3D-BA44-D9D74DBA7350}">
   <ds:schemaRefs>
-    <ds:schemaRef ds:uri="http://schemas.microsoft.com/sharepoint/v3/contenttype/forms"/>
+    <ds:schemaRef ds:uri="http://schemas.microsoft.com/office/2006/metadata/properties"/>
+    <ds:schemaRef ds:uri="http://schemas.microsoft.com/office/infopath/2007/PartnerControls"/>
+    <ds:schemaRef ds:uri="ee27a0f9-7ff9-4c05-b61a-f7053cc3ff56"/>
+    <ds:schemaRef ds:uri="8b0498ea-4bc6-4676-a87b-9cffe7f59fc7"/>
   </ds:schemaRefs>
 </ds:datastoreItem>
 </file>
 
 <file path=customXml/itemProps4.xml><?xml version="1.0" encoding="utf-8"?>
-<ds:datastoreItem xmlns:ds="http://schemas.openxmlformats.org/officeDocument/2006/customXml" ds:itemID="{6F49073C-3855-4E57-9CBA-5F69B75A20BC}">
+<ds:datastoreItem xmlns:ds="http://schemas.openxmlformats.org/officeDocument/2006/customXml" ds:itemID="{A5FD34C0-C740-482C-9ABE-2E19A5D31DBE}">
   <ds:schemaRefs>
     <ds:schemaRef ds:uri="http://schemas.openxmlformats.org/officeDocument/2006/bibliography"/>
   </ds:schemaRefs>

</xml_diff>